<commit_message>
Remove citation metrics and link complete publication lists
</commit_message>
<xml_diff>
--- a/CV_YUYUE.docx
+++ b/CV_YUYUE.docx
@@ -140,137 +140,6 @@
       </w:pPr>
       <w:r>
         <w:t>Integrated photonic circuits; optomechanics; microwave-to-optical transduction; nonlinear and quantum photonics; surface acoustic waves; and photonic and mechanical bound states in the continuum.</w:t>
-      </w:r>
-    </w:p>
-    <w:tbl>
-      <w:tblPr>
-        <w:tblW w:type="auto" w:w="0"/>
-        <w:jc w:val="left"/>
-        <w:tblLayout w:type="fixed"/>
-        <w:tblLook w:firstColumn="1" w:firstRow="1" w:lastColumn="0" w:lastRow="0" w:noHBand="0" w:noVBand="1" w:val="04A0"/>
-      </w:tblPr>
-      <w:tblGrid>
-        <w:gridCol w:w="3389"/>
-        <w:gridCol w:w="3389"/>
-        <w:gridCol w:w="3389"/>
-      </w:tblGrid>
-      <w:tr>
-        <w:tc>
-          <w:tcPr>
-            <w:tcW w:type="dxa" w:w="3370"/>
-            <w:shd w:fill="EAF0DE"/>
-            <w:tcMar>
-              <w:top w:w="60" w:type="dxa"/>
-              <w:start w:w="100" w:type="dxa"/>
-              <w:bottom w:w="60" w:type="dxa"/>
-              <w:end w:w="100" w:type="dxa"/>
-            </w:tcMar>
-          </w:tcPr>
-          <w:p>
-            <w:pPr>
-              <w:spacing w:after="0"/>
-              <w:jc w:val="center"/>
-            </w:pPr>
-            <w:r>
-              <w:rPr>
-                <w:b/>
-                <w:color w:val="18324A"/>
-                <w:sz w:val="24"/>
-              </w:rPr>
-              <w:t xml:space="preserve">467  </w:t>
-            </w:r>
-            <w:r>
-              <w:rPr>
-                <w:b/>
-                <w:color w:val="79933C"/>
-                <w:sz w:val="15"/>
-              </w:rPr>
-              <w:t>CITATIONS</w:t>
-            </w:r>
-          </w:p>
-        </w:tc>
-        <w:tc>
-          <w:tcPr>
-            <w:tcW w:type="dxa" w:w="3370"/>
-            <w:shd w:fill="EAF0DE"/>
-            <w:tcMar>
-              <w:top w:w="60" w:type="dxa"/>
-              <w:start w:w="100" w:type="dxa"/>
-              <w:bottom w:w="60" w:type="dxa"/>
-              <w:end w:w="100" w:type="dxa"/>
-            </w:tcMar>
-          </w:tcPr>
-          <w:p>
-            <w:pPr>
-              <w:spacing w:after="0"/>
-              <w:jc w:val="center"/>
-            </w:pPr>
-            <w:r>
-              <w:rPr>
-                <w:b/>
-                <w:color w:val="18324A"/>
-                <w:sz w:val="24"/>
-              </w:rPr>
-              <w:t xml:space="preserve">11  </w:t>
-            </w:r>
-            <w:r>
-              <w:rPr>
-                <w:b/>
-                <w:color w:val="79933C"/>
-                <w:sz w:val="15"/>
-              </w:rPr>
-              <w:t>h-INDEX</w:t>
-            </w:r>
-          </w:p>
-        </w:tc>
-        <w:tc>
-          <w:tcPr>
-            <w:tcW w:type="dxa" w:w="3370"/>
-            <w:shd w:fill="EAF0DE"/>
-            <w:tcMar>
-              <w:top w:w="60" w:type="dxa"/>
-              <w:start w:w="100" w:type="dxa"/>
-              <w:bottom w:w="60" w:type="dxa"/>
-              <w:end w:w="100" w:type="dxa"/>
-            </w:tcMar>
-          </w:tcPr>
-          <w:p>
-            <w:pPr>
-              <w:spacing w:after="0"/>
-              <w:jc w:val="center"/>
-            </w:pPr>
-            <w:r>
-              <w:rPr>
-                <w:b/>
-                <w:color w:val="18324A"/>
-                <w:sz w:val="24"/>
-              </w:rPr>
-              <w:t xml:space="preserve">12  </w:t>
-            </w:r>
-            <w:r>
-              <w:rPr>
-                <w:b/>
-                <w:color w:val="79933C"/>
-                <w:sz w:val="15"/>
-              </w:rPr>
-              <w:t>i10-INDEX</w:t>
-            </w:r>
-          </w:p>
-        </w:tc>
-      </w:tr>
-    </w:tbl>
-    <w:p>
-      <w:pPr>
-        <w:spacing w:after="20"/>
-        <w:jc w:val="right"/>
-      </w:pPr>
-      <w:r>
-        <w:rPr>
-          <w:i/>
-          <w:color w:val="59636B"/>
-          <w:sz w:val="15"/>
-        </w:rPr>
-        <w:t>Google Scholar metrics verified August 2026.</w:t>
       </w:r>
     </w:p>
     <w:p>
@@ -732,12 +601,16 @@
       <w:r>
         <w:t>, “</w:t>
       </w:r>
-      <w:r>
-        <w:rPr>
-          <w:i/>
-        </w:rPr>
-        <w:t>18-dB on-chip vacuum squeezing in an adaptively poled lithium niobate waveguide</w:t>
-      </w:r>
+      <w:hyperlink r:id="rId12">
+        <w:r>
+          <w:rPr>
+            <w:color w:val="18324A"/>
+            <w:u w:val="single"/>
+            <w:i w:val="true"/>
+          </w:rPr>
+          <w:t>18-dB on-chip vacuum squeezing in an adaptively poled lithium niobate waveguide</w:t>
+        </w:r>
+      </w:hyperlink>
       <w:r>
         <w:t xml:space="preserve">.” </w:t>
       </w:r>
@@ -783,12 +656,16 @@
       <w:r>
         <w:t>, “</w:t>
       </w:r>
-      <w:r>
-        <w:rPr>
-          <w:i/>
-        </w:rPr>
-        <w:t>Quantum squeezing in an all-resonant periodically poled lithium niobate microresonator</w:t>
-      </w:r>
+      <w:hyperlink r:id="rId13">
+        <w:r>
+          <w:rPr>
+            <w:color w:val="18324A"/>
+            <w:u w:val="single"/>
+            <w:i w:val="true"/>
+          </w:rPr>
+          <w:t>Quantum squeezing in an all-resonant periodically poled lithium niobate microresonator</w:t>
+        </w:r>
+      </w:hyperlink>
       <w:r>
         <w:t xml:space="preserve">.” </w:t>
       </w:r>
@@ -831,12 +708,16 @@
       <w:r>
         <w:t>, “</w:t>
       </w:r>
-      <w:r>
-        <w:rPr>
-          <w:i/>
-        </w:rPr>
-        <w:t>Uncooled low-noise thin-film optomechanical resonator for thermal sensing on lithium niobate</w:t>
-      </w:r>
+      <w:hyperlink r:id="rId14">
+        <w:r>
+          <w:rPr>
+            <w:color w:val="18324A"/>
+            <w:u w:val="single"/>
+            <w:i w:val="true"/>
+          </w:rPr>
+          <w:t>Uncooled low-noise thin-film optomechanical resonator for thermal sensing on lithium niobate</w:t>
+        </w:r>
+      </w:hyperlink>
       <w:r>
         <w:t xml:space="preserve">.” </w:t>
       </w:r>
@@ -882,12 +763,16 @@
       <w:r>
         <w:t>, “</w:t>
       </w:r>
-      <w:r>
-        <w:rPr>
-          <w:i/>
-        </w:rPr>
-        <w:t>Quantization-aware photonic homodyne computing for accelerated artificial intelligence and scientific simulation</w:t>
-      </w:r>
+      <w:hyperlink r:id="rId15">
+        <w:r>
+          <w:rPr>
+            <w:color w:val="18324A"/>
+            <w:u w:val="single"/>
+            <w:i w:val="true"/>
+          </w:rPr>
+          <w:t>Quantization-aware photonic homodyne computing for accelerated artificial intelligence and scientific simulation</w:t>
+        </w:r>
+      </w:hyperlink>
       <w:r>
         <w:t xml:space="preserve">.” </w:t>
       </w:r>
@@ -933,12 +818,16 @@
       <w:r>
         <w:t>, “</w:t>
       </w:r>
-      <w:r>
-        <w:rPr>
-          <w:i/>
-        </w:rPr>
-        <w:t>Suspended thin-film lithium niobate modulator for broadband mid-infrared light modulation and frequency comb generation</w:t>
-      </w:r>
+      <w:hyperlink r:id="rId16">
+        <w:r>
+          <w:rPr>
+            <w:color w:val="18324A"/>
+            <w:u w:val="single"/>
+            <w:i w:val="true"/>
+          </w:rPr>
+          <w:t>Suspended thin-film lithium niobate modulator for broadband mid-infrared light modulation and frequency comb generation</w:t>
+        </w:r>
+      </w:hyperlink>
       <w:r>
         <w:t xml:space="preserve">.” </w:t>
       </w:r>
@@ -981,12 +870,16 @@
       <w:r>
         <w:t>, “</w:t>
       </w:r>
-      <w:r>
-        <w:rPr>
-          <w:i/>
-        </w:rPr>
-        <w:t>Room-temperature low-noise optomechanical platform on thin-film lithium niobate</w:t>
-      </w:r>
+      <w:hyperlink r:id="rId17">
+        <w:r>
+          <w:rPr>
+            <w:color w:val="18324A"/>
+            <w:u w:val="single"/>
+            <w:i w:val="true"/>
+          </w:rPr>
+          <w:t>Room-temperature low-noise optomechanical platform on thin-film lithium niobate</w:t>
+        </w:r>
+      </w:hyperlink>
       <w:r>
         <w:t xml:space="preserve">.” </w:t>
       </w:r>
@@ -1032,12 +925,16 @@
       <w:r>
         <w:t>, “</w:t>
       </w:r>
-      <w:r>
-        <w:rPr>
-          <w:i/>
-        </w:rPr>
-        <w:t>Fundamental phase noise in thin-film lithium niobate resonators</w:t>
-      </w:r>
+      <w:hyperlink r:id="rId18">
+        <w:r>
+          <w:rPr>
+            <w:color w:val="18324A"/>
+            <w:u w:val="single"/>
+            <w:i w:val="true"/>
+          </w:rPr>
+          <w:t>Fundamental phase noise in thin-film lithium niobate resonators</w:t>
+        </w:r>
+      </w:hyperlink>
       <w:r>
         <w:t xml:space="preserve">.” </w:t>
       </w:r>
@@ -1072,12 +969,16 @@
       <w:r>
         <w:t>, “</w:t>
       </w:r>
-      <w:r>
-        <w:rPr>
-          <w:i/>
-        </w:rPr>
-        <w:t>Suspended, polarization-dependent, subwavelength-perforated metal absorber for mid-infrared bolometry</w:t>
-      </w:r>
+      <w:hyperlink r:id="rId19">
+        <w:r>
+          <w:rPr>
+            <w:color w:val="18324A"/>
+            <w:u w:val="single"/>
+            <w:i w:val="true"/>
+          </w:rPr>
+          <w:t>Suspended, polarization-dependent, subwavelength-perforated metal absorber for mid-infrared bolometry</w:t>
+        </w:r>
+      </w:hyperlink>
       <w:r>
         <w:t xml:space="preserve">.” </w:t>
       </w:r>
@@ -1112,12 +1013,16 @@
       <w:r>
         <w:t>, “</w:t>
       </w:r>
-      <w:r>
-        <w:rPr>
-          <w:i/>
-        </w:rPr>
-        <w:t>Hypermultiplexed integrated photonics–based optical tensor processor</w:t>
-      </w:r>
+      <w:hyperlink r:id="rId20">
+        <w:r>
+          <w:rPr>
+            <w:color w:val="18324A"/>
+            <w:u w:val="single"/>
+            <w:i w:val="true"/>
+          </w:rPr>
+          <w:t>Hypermultiplexed integrated photonics–based optical tensor processor</w:t>
+        </w:r>
+      </w:hyperlink>
       <w:r>
         <w:t xml:space="preserve">.” </w:t>
       </w:r>
@@ -1152,12 +1057,16 @@
       <w:r>
         <w:t>, “</w:t>
       </w:r>
-      <w:r>
-        <w:rPr>
-          <w:i/>
-        </w:rPr>
-        <w:t>Photorefractive and pyroelectric photonic memory and long-term stability in thin-film lithium niobate microresonators</w:t>
-      </w:r>
+      <w:hyperlink r:id="rId21">
+        <w:r>
+          <w:rPr>
+            <w:color w:val="18324A"/>
+            <w:u w:val="single"/>
+            <w:i w:val="true"/>
+          </w:rPr>
+          <w:t>Photorefractive and pyroelectric photonic memory and long-term stability in thin-film lithium niobate microresonators</w:t>
+        </w:r>
+      </w:hyperlink>
       <w:r>
         <w:t xml:space="preserve">.” </w:t>
       </w:r>
@@ -1189,12 +1098,16 @@
       <w:r>
         <w:t>, “</w:t>
       </w:r>
-      <w:r>
-        <w:rPr>
-          <w:i/>
-        </w:rPr>
-        <w:t>Surface acoustic microwave photonic filters on an etchless lithium niobate integrated platform</w:t>
-      </w:r>
+      <w:hyperlink r:id="rId22">
+        <w:r>
+          <w:rPr>
+            <w:color w:val="18324A"/>
+            <w:u w:val="single"/>
+            <w:i w:val="true"/>
+          </w:rPr>
+          <w:t>Surface acoustic microwave photonic filters on an etchless lithium niobate integrated platform</w:t>
+        </w:r>
+      </w:hyperlink>
       <w:r>
         <w:t xml:space="preserve">.” </w:t>
       </w:r>
@@ -1226,12 +1139,16 @@
       <w:r>
         <w:t>, “</w:t>
       </w:r>
-      <w:r>
-        <w:rPr>
-          <w:i/>
-        </w:rPr>
-        <w:t>Etchless photonic integrated circuits enabled by bound states in the continuum: tutorial</w:t>
-      </w:r>
+      <w:hyperlink r:id="rId23">
+        <w:r>
+          <w:rPr>
+            <w:color w:val="18324A"/>
+            <w:u w:val="single"/>
+            <w:i w:val="true"/>
+          </w:rPr>
+          <w:t>Etchless photonic integrated circuits enabled by bound states in the continuum: tutorial</w:t>
+        </w:r>
+      </w:hyperlink>
       <w:r>
         <w:t xml:space="preserve">.” </w:t>
       </w:r>
@@ -1277,12 +1194,16 @@
       <w:r>
         <w:t>, “</w:t>
       </w:r>
-      <w:r>
-        <w:rPr>
-          <w:i/>
-        </w:rPr>
-        <w:t>Fundamentals and applications of photonic waveguides with bound states in the continuum</w:t>
-      </w:r>
+      <w:hyperlink r:id="rId24">
+        <w:r>
+          <w:rPr>
+            <w:color w:val="18324A"/>
+            <w:u w:val="single"/>
+            <w:i w:val="true"/>
+          </w:rPr>
+          <w:t>Fundamentals and applications of photonic waveguides with bound states in the continuum</w:t>
+        </w:r>
+      </w:hyperlink>
       <w:r>
         <w:t xml:space="preserve">.” </w:t>
       </w:r>
@@ -1317,12 +1238,16 @@
       <w:r>
         <w:t>, “</w:t>
       </w:r>
-      <w:r>
-        <w:rPr>
-          <w:i/>
-        </w:rPr>
-        <w:t>Coupling of photon emitters in monolayer WS₂ with a photonic waveguide based on bound states in the continuum</w:t>
-      </w:r>
+      <w:hyperlink r:id="rId25">
+        <w:r>
+          <w:rPr>
+            <w:color w:val="18324A"/>
+            <w:u w:val="single"/>
+            <w:i w:val="true"/>
+          </w:rPr>
+          <w:t>Coupling of photon emitters in monolayer WS₂ with a photonic waveguide based on bound states in the continuum</w:t>
+        </w:r>
+      </w:hyperlink>
       <w:r>
         <w:t xml:space="preserve">.” </w:t>
       </w:r>
@@ -1357,12 +1282,16 @@
       <w:r>
         <w:t>, “</w:t>
       </w:r>
-      <w:r>
-        <w:rPr>
-          <w:i/>
-        </w:rPr>
-        <w:t>Inverse-designed linear coherent photonic networks for high-resolution spectral reconstruction</w:t>
-      </w:r>
+      <w:hyperlink r:id="rId26">
+        <w:r>
+          <w:rPr>
+            <w:color w:val="18324A"/>
+            <w:u w:val="single"/>
+            <w:i w:val="true"/>
+          </w:rPr>
+          <w:t>Inverse-designed linear coherent photonic networks for high-resolution spectral reconstruction</w:t>
+        </w:r>
+      </w:hyperlink>
       <w:r>
         <w:t xml:space="preserve">.” </w:t>
       </w:r>
@@ -1408,12 +1337,16 @@
       <w:r>
         <w:t>, “</w:t>
       </w:r>
-      <w:r>
-        <w:rPr>
-          <w:i/>
-        </w:rPr>
-        <w:t>Neural optimizer for inverse design of complex-modulated holograms implemented by plasmonic metasurfaces</w:t>
-      </w:r>
+      <w:hyperlink r:id="rId27">
+        <w:r>
+          <w:rPr>
+            <w:color w:val="18324A"/>
+            <w:u w:val="single"/>
+            <w:i w:val="true"/>
+          </w:rPr>
+          <w:t>Neural optimizer for inverse design of complex-modulated holograms implemented by plasmonic metasurfaces</w:t>
+        </w:r>
+      </w:hyperlink>
       <w:r>
         <w:t xml:space="preserve">.” </w:t>
       </w:r>
@@ -1445,12 +1378,16 @@
       <w:r>
         <w:t>, “</w:t>
       </w:r>
-      <w:r>
-        <w:rPr>
-          <w:i/>
-        </w:rPr>
-        <w:t>Observation of mechanical bound states in the continuum in an optomechanical microresonator</w:t>
-      </w:r>
+      <w:hyperlink r:id="rId28">
+        <w:r>
+          <w:rPr>
+            <w:color w:val="18324A"/>
+            <w:u w:val="single"/>
+            <w:i w:val="true"/>
+          </w:rPr>
+          <w:t>Observation of mechanical bound states in the continuum in an optomechanical microresonator</w:t>
+        </w:r>
+      </w:hyperlink>
       <w:r>
         <w:t xml:space="preserve">.” </w:t>
       </w:r>
@@ -1482,12 +1419,16 @@
       <w:r>
         <w:t>, “</w:t>
       </w:r>
-      <w:r>
-        <w:rPr>
-          <w:i/>
-        </w:rPr>
-        <w:t>Wavelength-division multiplexing on an etchless lithium niobate integrated platform</w:t>
-      </w:r>
+      <w:hyperlink r:id="rId29">
+        <w:r>
+          <w:rPr>
+            <w:color w:val="18324A"/>
+            <w:u w:val="single"/>
+            <w:i w:val="true"/>
+          </w:rPr>
+          <w:t>Wavelength-division multiplexing on an etchless lithium niobate integrated platform</w:t>
+        </w:r>
+      </w:hyperlink>
       <w:r>
         <w:t xml:space="preserve">.” </w:t>
       </w:r>
@@ -1522,12 +1463,16 @@
       <w:r>
         <w:t>, “</w:t>
       </w:r>
-      <w:r>
-        <w:rPr>
-          <w:i/>
-        </w:rPr>
-        <w:t>Second-harmonic generation in etchless lithium niobate nanophotonic waveguides with bound states in the continuum</w:t>
-      </w:r>
+      <w:hyperlink r:id="rId30">
+        <w:r>
+          <w:rPr>
+            <w:color w:val="18324A"/>
+            <w:u w:val="single"/>
+            <w:i w:val="true"/>
+          </w:rPr>
+          <w:t>Second-harmonic generation in etchless lithium niobate nanophotonic waveguides with bound states in the continuum</w:t>
+        </w:r>
+      </w:hyperlink>
       <w:r>
         <w:t xml:space="preserve">.” </w:t>
       </w:r>
@@ -1559,12 +1504,16 @@
       <w:r>
         <w:t>, “</w:t>
       </w:r>
-      <w:r>
-        <w:rPr>
-          <w:i/>
-        </w:rPr>
-        <w:t>Demonstration of on-chip gigahertz acousto-optic modulation at near-visible wavelengths</w:t>
-      </w:r>
+      <w:hyperlink r:id="rId31">
+        <w:r>
+          <w:rPr>
+            <w:color w:val="18324A"/>
+            <w:u w:val="single"/>
+            <w:i w:val="true"/>
+          </w:rPr>
+          <w:t>Demonstration of on-chip gigahertz acousto-optic modulation at near-visible wavelengths</w:t>
+        </w:r>
+      </w:hyperlink>
       <w:r>
         <w:t xml:space="preserve">.” </w:t>
       </w:r>
@@ -1596,12 +1545,16 @@
       <w:r>
         <w:t>, “</w:t>
       </w:r>
-      <w:r>
-        <w:rPr>
-          <w:i/>
-        </w:rPr>
-        <w:t>Ultralow-loss etchless lithium niobate integrated photonics at near-visible wavelengths</w:t>
-      </w:r>
+      <w:hyperlink r:id="rId32">
+        <w:r>
+          <w:rPr>
+            <w:color w:val="18324A"/>
+            <w:u w:val="single"/>
+            <w:i w:val="true"/>
+          </w:rPr>
+          <w:t>Ultralow-loss etchless lithium niobate integrated photonics at near-visible wavelengths</w:t>
+        </w:r>
+      </w:hyperlink>
       <w:r>
         <w:t xml:space="preserve">.” </w:t>
       </w:r>
@@ -1636,12 +1589,16 @@
       <w:r>
         <w:t>, “</w:t>
       </w:r>
-      <w:r>
-        <w:rPr>
-          <w:i/>
-        </w:rPr>
-        <w:t>Broadband meta-converters for multiple Laguerre–Gaussian modes</w:t>
-      </w:r>
+      <w:hyperlink r:id="rId33">
+        <w:r>
+          <w:rPr>
+            <w:color w:val="18324A"/>
+            <w:u w:val="single"/>
+            <w:i w:val="true"/>
+          </w:rPr>
+          <w:t>Broadband meta-converters for multiple Laguerre–Gaussian modes</w:t>
+        </w:r>
+      </w:hyperlink>
       <w:r>
         <w:t xml:space="preserve">.” </w:t>
       </w:r>
@@ -1673,12 +1630,16 @@
       <w:r>
         <w:t>, “</w:t>
       </w:r>
-      <w:r>
-        <w:rPr>
-          <w:i/>
-        </w:rPr>
-        <w:t>Nonmetallic broadband visible-light absorbers with polarization and incident-angle insensitivity</w:t>
-      </w:r>
+      <w:hyperlink r:id="rId34">
+        <w:r>
+          <w:rPr>
+            <w:color w:val="18324A"/>
+            <w:u w:val="single"/>
+            <w:i w:val="true"/>
+          </w:rPr>
+          <w:t>Nonmetallic broadband visible-light absorbers with polarization and incident-angle insensitivity</w:t>
+        </w:r>
+      </w:hyperlink>
       <w:r>
         <w:t xml:space="preserve">.” </w:t>
       </w:r>
@@ -1731,17 +1692,21 @@
         <w:t>Y. Yu</w:t>
       </w:r>
       <w:r>
-        <w:t>, R. Yin, Z. Sakotic, I. Anderson, S. Guadagnini, Y. Wang, I. Christen, et al.</w:t>
+        <w:t>†, R. Yin†, Z. Sakotic, I. Anderson, S. Guadagnini, Y. Wang, I. Christen, R. Lu, M. L. Povinelli, D. Wasserman, and M. Yu</w:t>
       </w:r>
       <w:r>
         <w:t>, “</w:t>
       </w:r>
-      <w:r>
-        <w:rPr>
-          <w:i/>
-        </w:rPr>
-        <w:t>Monolithic room-temperature mid-infrared detector based on a thin-film lithium niobate optomechanical resonator</w:t>
-      </w:r>
+      <w:hyperlink r:id="rId35">
+        <w:r>
+          <w:rPr>
+            <w:color w:val="18324A"/>
+            <w:u w:val="single"/>
+            <w:i w:val="true"/>
+          </w:rPr>
+          <w:t>Monolithic room-temperature mid-infrared detector based on a thin-film lithium niobate optomechanical resonator</w:t>
+        </w:r>
+      </w:hyperlink>
       <w:r>
         <w:t xml:space="preserve">.” </w:t>
       </w:r>
@@ -1761,17 +1726,31 @@
         <w:pStyle w:val="CVPublication"/>
       </w:pPr>
       <w:r>
-        <w:t>T. S. Karnik, X. Ren, C.-H. Lee, M. Chaudhari, I. Christen, K. Kwon, K. Kunes, et al.</w:t>
+        <w:t xml:space="preserve">T. S. Karnik, X. Ren, C.-H. Lee, M. Chaudhari, I. Christen, K. Kwon, K. Kunes, R. Kopparapu, C. Cheung, J. Wang, </w:t>
+      </w:r>
+      <w:r>
+        <w:rPr>
+          <w:b/>
+          <w:color w:val="18324A"/>
+        </w:rPr>
+        <w:t>Y. Yu</w:t>
+      </w:r>
+      <w:r>
+        <w:t>, R. Yin, B.-H. Wu, S.-Y. Ma, Q. Zhuang, D. Englund, Z. Chen, and M. Yu</w:t>
       </w:r>
       <w:r>
         <w:t>, “</w:t>
       </w:r>
-      <w:r>
-        <w:rPr>
-          <w:i/>
-        </w:rPr>
-        <w:t>Vacuum squeezing in adaptively poled lithium niobate nanowaveguides</w:t>
-      </w:r>
+      <w:hyperlink r:id="rId36">
+        <w:r>
+          <w:rPr>
+            <w:color w:val="18324A"/>
+            <w:u w:val="single"/>
+            <w:i w:val="true"/>
+          </w:rPr>
+          <w:t>Vacuum squeezing in adaptively poled lithium niobate nanowaveguides</w:t>
+        </w:r>
+      </w:hyperlink>
       <w:r>
         <w:t xml:space="preserve">.” </w:t>
       </w:r>
@@ -1817,12 +1796,16 @@
       <w:r>
         <w:t>, “</w:t>
       </w:r>
-      <w:r>
-        <w:rPr>
-          <w:i/>
-        </w:rPr>
-        <w:t>Opto-electro-mechanical oscillator on thin-film lithium niobate</w:t>
-      </w:r>
+      <w:hyperlink r:id="rId37">
+        <w:r>
+          <w:rPr>
+            <w:color w:val="18324A"/>
+            <w:u w:val="single"/>
+            <w:i w:val="true"/>
+          </w:rPr>
+          <w:t>Opto-electro-mechanical oscillator on thin-film lithium niobate</w:t>
+        </w:r>
+      </w:hyperlink>
       <w:r>
         <w:t xml:space="preserve">.” </w:t>
       </w:r>
@@ -1857,12 +1840,16 @@
       <w:r>
         <w:t>, “</w:t>
       </w:r>
-      <w:r>
-        <w:rPr>
-          <w:i/>
-        </w:rPr>
-        <w:t>Suspended subwavelength-perforated metal absorber for mid-infrared bolometry</w:t>
-      </w:r>
+      <w:hyperlink r:id="rId38">
+        <w:r>
+          <w:rPr>
+            <w:color w:val="18324A"/>
+            <w:u w:val="single"/>
+            <w:i w:val="true"/>
+          </w:rPr>
+          <w:t>Suspended subwavelength-perforated metal absorber for mid-infrared bolometry</w:t>
+        </w:r>
+      </w:hyperlink>
       <w:r>
         <w:t xml:space="preserve">.” </w:t>
       </w:r>
@@ -1897,12 +1884,16 @@
       <w:r>
         <w:t>, “</w:t>
       </w:r>
-      <w:r>
-        <w:rPr>
-          <w:i/>
-        </w:rPr>
-        <w:t>Few-cycle pulse generation on the thin-film lithium niobate platform</w:t>
-      </w:r>
+      <w:hyperlink r:id="rId39">
+        <w:r>
+          <w:rPr>
+            <w:color w:val="18324A"/>
+            <w:u w:val="single"/>
+            <w:i w:val="true"/>
+          </w:rPr>
+          <w:t>Few-cycle pulse generation on the thin-film lithium niobate platform</w:t>
+        </w:r>
+      </w:hyperlink>
       <w:r>
         <w:t xml:space="preserve">.” </w:t>
       </w:r>
@@ -1937,12 +1928,16 @@
       <w:r>
         <w:t>, “</w:t>
       </w:r>
-      <w:r>
-        <w:rPr>
-          <w:i/>
-        </w:rPr>
-        <w:t>Intrinsic frequency noise of thin-film lithium niobate platforms</w:t>
-      </w:r>
+      <w:hyperlink r:id="rId40">
+        <w:r>
+          <w:rPr>
+            <w:color w:val="18324A"/>
+            <w:u w:val="single"/>
+            <w:i w:val="true"/>
+          </w:rPr>
+          <w:t>Intrinsic frequency noise of thin-film lithium niobate platforms</w:t>
+        </w:r>
+      </w:hyperlink>
       <w:r>
         <w:t xml:space="preserve">.” </w:t>
       </w:r>
@@ -1974,12 +1969,16 @@
       <w:r>
         <w:t>, “</w:t>
       </w:r>
-      <w:r>
-        <w:rPr>
-          <w:i/>
-        </w:rPr>
-        <w:t>Room-temperature optomechanical-resonator-based thermal sensor on thin-film lithium niobate</w:t>
-      </w:r>
+      <w:hyperlink r:id="rId41">
+        <w:r>
+          <w:rPr>
+            <w:color w:val="18324A"/>
+            <w:u w:val="single"/>
+            <w:i w:val="true"/>
+          </w:rPr>
+          <w:t>Room-temperature optomechanical-resonator-based thermal sensor on thin-film lithium niobate</w:t>
+        </w:r>
+      </w:hyperlink>
       <w:r>
         <w:t xml:space="preserve">.” </w:t>
       </w:r>
@@ -2014,12 +2013,16 @@
       <w:r>
         <w:t>, “</w:t>
       </w:r>
-      <w:r>
-        <w:rPr>
-          <w:i/>
-        </w:rPr>
-        <w:t>Mid-wavelength infrared IM/DD communications using an air-suspended thin-film lithium niobate intensity modulator</w:t>
-      </w:r>
+      <w:hyperlink r:id="rId42">
+        <w:r>
+          <w:rPr>
+            <w:color w:val="18324A"/>
+            <w:u w:val="single"/>
+            <w:i w:val="true"/>
+          </w:rPr>
+          <w:t>Mid-wavelength infrared IM/DD communications using an air-suspended thin-film lithium niobate intensity modulator</w:t>
+        </w:r>
+      </w:hyperlink>
       <w:r>
         <w:t xml:space="preserve">.” </w:t>
       </w:r>
@@ -2054,12 +2057,16 @@
       <w:r>
         <w:t>, “</w:t>
       </w:r>
-      <w:r>
-        <w:rPr>
-          <w:i/>
-        </w:rPr>
-        <w:t>Lithium niobate chip-based ultrafast optical signal processor</w:t>
-      </w:r>
+      <w:hyperlink r:id="rId43">
+        <w:r>
+          <w:rPr>
+            <w:color w:val="18324A"/>
+            <w:u w:val="single"/>
+            <w:i w:val="true"/>
+          </w:rPr>
+          <w:t>Lithium niobate chip-based ultrafast optical signal processor</w:t>
+        </w:r>
+      </w:hyperlink>
       <w:r>
         <w:t xml:space="preserve">.” </w:t>
       </w:r>
@@ -2094,12 +2101,16 @@
       <w:r>
         <w:t>, “</w:t>
       </w:r>
-      <w:r>
-        <w:rPr>
-          <w:i/>
-        </w:rPr>
-        <w:t>Long-lived photorefractive and pyroelectric effects in thin-film lithium niobate microresonators</w:t>
-      </w:r>
+      <w:hyperlink r:id="rId44">
+        <w:r>
+          <w:rPr>
+            <w:color w:val="18324A"/>
+            <w:u w:val="single"/>
+            <w:i w:val="true"/>
+          </w:rPr>
+          <w:t>Long-lived photorefractive and pyroelectric effects in thin-film lithium niobate microresonators</w:t>
+        </w:r>
+      </w:hyperlink>
       <w:r>
         <w:t xml:space="preserve">.” </w:t>
       </w:r>
@@ -2131,12 +2142,16 @@
       <w:r>
         <w:t>, “</w:t>
       </w:r>
-      <w:r>
-        <w:rPr>
-          <w:i/>
-        </w:rPr>
-        <w:t>Surface acoustic microwave photonic filters on an etchless lithium niobate integrated platform</w:t>
-      </w:r>
+      <w:hyperlink r:id="rId22">
+        <w:r>
+          <w:rPr>
+            <w:color w:val="18324A"/>
+            <w:u w:val="single"/>
+            <w:i w:val="true"/>
+          </w:rPr>
+          <w:t>Surface acoustic microwave photonic filters on an etchless lithium niobate integrated platform</w:t>
+        </w:r>
+      </w:hyperlink>
       <w:r>
         <w:t xml:space="preserve">.” </w:t>
       </w:r>
@@ -2171,12 +2186,16 @@
       <w:r>
         <w:t>, “</w:t>
       </w:r>
-      <w:r>
-        <w:rPr>
-          <w:i/>
-        </w:rPr>
-        <w:t>Inverse-designed linear coherent photonic networks for high-resolution spectral reconstruction</w:t>
-      </w:r>
+      <w:hyperlink r:id="rId26">
+        <w:r>
+          <w:rPr>
+            <w:color w:val="18324A"/>
+            <w:u w:val="single"/>
+            <w:i w:val="true"/>
+          </w:rPr>
+          <w:t>Inverse-designed linear coherent photonic networks for high-resolution spectral reconstruction</w:t>
+        </w:r>
+      </w:hyperlink>
       <w:r>
         <w:t xml:space="preserve">.” </w:t>
       </w:r>
@@ -2208,12 +2227,16 @@
       <w:r>
         <w:t>, “</w:t>
       </w:r>
-      <w:r>
-        <w:rPr>
-          <w:i/>
-        </w:rPr>
-        <w:t>Observation of mechanical bound states in the continuum in an optomechanical microresonator</w:t>
-      </w:r>
+      <w:hyperlink r:id="rId28">
+        <w:r>
+          <w:rPr>
+            <w:color w:val="18324A"/>
+            <w:u w:val="single"/>
+            <w:i w:val="true"/>
+          </w:rPr>
+          <w:t>Observation of mechanical bound states in the continuum in an optomechanical microresonator</w:t>
+        </w:r>
+      </w:hyperlink>
       <w:r>
         <w:t xml:space="preserve">.” </w:t>
       </w:r>
@@ -2256,12 +2279,16 @@
       <w:r>
         <w:t>, “</w:t>
       </w:r>
-      <w:r>
-        <w:rPr>
-          <w:i/>
-        </w:rPr>
-        <w:t>Wavelength-division multiplexing on an etchless lithium niobate integrated platform</w:t>
-      </w:r>
+      <w:hyperlink r:id="rId29">
+        <w:r>
+          <w:rPr>
+            <w:color w:val="18324A"/>
+            <w:u w:val="single"/>
+            <w:i w:val="true"/>
+          </w:rPr>
+          <w:t>Wavelength-division multiplexing on an etchless lithium niobate integrated platform</w:t>
+        </w:r>
+      </w:hyperlink>
       <w:r>
         <w:t xml:space="preserve">.” </w:t>
       </w:r>
@@ -2293,12 +2320,16 @@
       <w:r>
         <w:t>, “</w:t>
       </w:r>
-      <w:r>
-        <w:rPr>
-          <w:i/>
-        </w:rPr>
-        <w:t>Ultralow-loss etchless lithium niobate integrated photonics at near-visible wavelengths</w:t>
-      </w:r>
+      <w:hyperlink r:id="rId32">
+        <w:r>
+          <w:rPr>
+            <w:color w:val="18324A"/>
+            <w:u w:val="single"/>
+            <w:i w:val="true"/>
+          </w:rPr>
+          <w:t>Ultralow-loss etchless lithium niobate integrated photonics at near-visible wavelengths</w:t>
+        </w:r>
+      </w:hyperlink>
       <w:r>
         <w:t xml:space="preserve">.” </w:t>
       </w:r>
@@ -2333,12 +2364,16 @@
       <w:r>
         <w:t>, “</w:t>
       </w:r>
-      <w:r>
-        <w:rPr>
-          <w:i/>
-        </w:rPr>
-        <w:t>Second-harmonic generation in etchless lithium niobate nanophotonic waveguides with bound states in the continuum</w:t>
-      </w:r>
+      <w:hyperlink r:id="rId30">
+        <w:r>
+          <w:rPr>
+            <w:color w:val="18324A"/>
+            <w:u w:val="single"/>
+            <w:i w:val="true"/>
+          </w:rPr>
+          <w:t>Second-harmonic generation in etchless lithium niobate nanophotonic waveguides with bound states in the continuum</w:t>
+        </w:r>
+      </w:hyperlink>
       <w:r>
         <w:t xml:space="preserve">.” </w:t>
       </w:r>
@@ -2370,12 +2405,16 @@
       <w:r>
         <w:t>, “</w:t>
       </w:r>
-      <w:r>
-        <w:rPr>
-          <w:i/>
-        </w:rPr>
-        <w:t>Etchless lithium niobate integrated photonics</w:t>
-      </w:r>
+      <w:hyperlink r:id="rId45">
+        <w:r>
+          <w:rPr>
+            <w:color w:val="18324A"/>
+            <w:u w:val="single"/>
+            <w:i w:val="true"/>
+          </w:rPr>
+          <w:t>Etchless lithium niobate integrated photonics</w:t>
+        </w:r>
+      </w:hyperlink>
       <w:r>
         <w:t xml:space="preserve">.” </w:t>
       </w:r>
@@ -2418,12 +2457,16 @@
       <w:r>
         <w:t>, “</w:t>
       </w:r>
-      <w:r>
-        <w:rPr>
-          <w:i/>
-        </w:rPr>
-        <w:t>Nonmetallic broadband visible-light absorbers with polarization and incident-angle insensitivity</w:t>
-      </w:r>
+      <w:hyperlink r:id="rId34">
+        <w:r>
+          <w:rPr>
+            <w:color w:val="18324A"/>
+            <w:u w:val="single"/>
+            <w:i w:val="true"/>
+          </w:rPr>
+          <w:t>Nonmetallic broadband visible-light absorbers with polarization and incident-angle insensitivity</w:t>
+        </w:r>
+      </w:hyperlink>
       <w:r>
         <w:t xml:space="preserve">.” </w:t>
       </w:r>
@@ -2455,12 +2498,16 @@
       <w:r>
         <w:t>, “</w:t>
       </w:r>
-      <w:r>
-        <w:rPr>
-          <w:i/>
-        </w:rPr>
-        <w:t>Demonstration of on-chip gigahertz acousto-optic modulation at near-visible wavelengths</w:t>
-      </w:r>
+      <w:hyperlink r:id="rId31">
+        <w:r>
+          <w:rPr>
+            <w:color w:val="18324A"/>
+            <w:u w:val="single"/>
+            <w:i w:val="true"/>
+          </w:rPr>
+          <w:t>Demonstration of on-chip gigahertz acousto-optic modulation at near-visible wavelengths</w:t>
+        </w:r>
+      </w:hyperlink>
       <w:r>
         <w:t xml:space="preserve">.” </w:t>
       </w:r>
@@ -2472,7 +2519,7 @@
       </w:r>
     </w:p>
     <w:sectPr>
-      <w:footerReference w:type="default" r:id="rId12"/>
+      <w:footerReference w:type="default" r:id="rId46"/>
       <w:pgSz w:w="12240" w:h="15840"/>
       <w:pgMar w:top="893" w:right="1037" w:bottom="893" w:left="1037" w:header="360" w:footer="360" w:gutter="0"/>
       <w:cols w:space="720"/>

</xml_diff>

<commit_message>
Move publication links to citation endings
</commit_message>
<xml_diff>
--- a/CV_YUYUE.docx
+++ b/CV_YUYUE.docx
@@ -601,16 +601,12 @@
       <w:r>
         <w:t>, “</w:t>
       </w:r>
-      <w:hyperlink r:id="rId12">
-        <w:r>
-          <w:rPr>
-            <w:color w:val="18324A"/>
-            <w:u w:val="single"/>
-            <w:i w:val="true"/>
-          </w:rPr>
-          <w:t>18-dB on-chip vacuum squeezing in an adaptively poled lithium niobate waveguide</w:t>
-        </w:r>
-      </w:hyperlink>
+      <w:r>
+        <w:rPr>
+          <w:i/>
+        </w:rPr>
+        <w:t>18-dB on-chip vacuum squeezing in an adaptively poled lithium niobate waveguide</w:t>
+      </w:r>
       <w:r>
         <w:t xml:space="preserve">.” </w:t>
       </w:r>
@@ -631,6 +627,18 @@
         </w:rPr>
         <w:t>PREPRINT</w:t>
       </w:r>
+      <w:r>
+        <w:t xml:space="preserve">  ·  </w:t>
+      </w:r>
+      <w:hyperlink r:id="rId12">
+        <w:r>
+          <w:rPr>
+            <w:color w:val="79933C"/>
+            <w:u w:val="single"/>
+          </w:rPr>
+          <w:t>Link</w:t>
+        </w:r>
+      </w:hyperlink>
     </w:p>
     <w:p>
       <w:pPr>
@@ -656,16 +664,12 @@
       <w:r>
         <w:t>, “</w:t>
       </w:r>
-      <w:hyperlink r:id="rId13">
-        <w:r>
-          <w:rPr>
-            <w:color w:val="18324A"/>
-            <w:u w:val="single"/>
-            <w:i w:val="true"/>
-          </w:rPr>
-          <w:t>Quantum squeezing in an all-resonant periodically poled lithium niobate microresonator</w:t>
-        </w:r>
-      </w:hyperlink>
+      <w:r>
+        <w:rPr>
+          <w:i/>
+        </w:rPr>
+        <w:t>Quantum squeezing in an all-resonant periodically poled lithium niobate microresonator</w:t>
+      </w:r>
       <w:r>
         <w:t xml:space="preserve">.” </w:t>
       </w:r>
@@ -686,6 +690,18 @@
         </w:rPr>
         <w:t>PREPRINT</w:t>
       </w:r>
+      <w:r>
+        <w:t xml:space="preserve">  ·  </w:t>
+      </w:r>
+      <w:hyperlink r:id="rId13">
+        <w:r>
+          <w:rPr>
+            <w:color w:val="79933C"/>
+            <w:u w:val="single"/>
+          </w:rPr>
+          <w:t>Link</w:t>
+        </w:r>
+      </w:hyperlink>
     </w:p>
     <w:p>
       <w:pPr>
@@ -708,16 +724,12 @@
       <w:r>
         <w:t>, “</w:t>
       </w:r>
-      <w:hyperlink r:id="rId14">
-        <w:r>
-          <w:rPr>
-            <w:color w:val="18324A"/>
-            <w:u w:val="single"/>
-            <w:i w:val="true"/>
-          </w:rPr>
-          <w:t>Uncooled low-noise thin-film optomechanical resonator for thermal sensing on lithium niobate</w:t>
-        </w:r>
-      </w:hyperlink>
+      <w:r>
+        <w:rPr>
+          <w:i/>
+        </w:rPr>
+        <w:t>Uncooled low-noise thin-film optomechanical resonator for thermal sensing on lithium niobate</w:t>
+      </w:r>
       <w:r>
         <w:t xml:space="preserve">.” </w:t>
       </w:r>
@@ -738,6 +750,18 @@
         </w:rPr>
         <w:t>PREPRINT</w:t>
       </w:r>
+      <w:r>
+        <w:t xml:space="preserve">  ·  </w:t>
+      </w:r>
+      <w:hyperlink r:id="rId14">
+        <w:r>
+          <w:rPr>
+            <w:color w:val="79933C"/>
+            <w:u w:val="single"/>
+          </w:rPr>
+          <w:t>Link</w:t>
+        </w:r>
+      </w:hyperlink>
     </w:p>
     <w:p>
       <w:pPr>
@@ -763,16 +787,12 @@
       <w:r>
         <w:t>, “</w:t>
       </w:r>
-      <w:hyperlink r:id="rId15">
-        <w:r>
-          <w:rPr>
-            <w:color w:val="18324A"/>
-            <w:u w:val="single"/>
-            <w:i w:val="true"/>
-          </w:rPr>
-          <w:t>Quantization-aware photonic homodyne computing for accelerated artificial intelligence and scientific simulation</w:t>
-        </w:r>
-      </w:hyperlink>
+      <w:r>
+        <w:rPr>
+          <w:i/>
+        </w:rPr>
+        <w:t>Quantization-aware photonic homodyne computing for accelerated artificial intelligence and scientific simulation</w:t>
+      </w:r>
       <w:r>
         <w:t xml:space="preserve">.” </w:t>
       </w:r>
@@ -793,6 +813,18 @@
         </w:rPr>
         <w:t>PREPRINT</w:t>
       </w:r>
+      <w:r>
+        <w:t xml:space="preserve">  ·  </w:t>
+      </w:r>
+      <w:hyperlink r:id="rId15">
+        <w:r>
+          <w:rPr>
+            <w:color w:val="79933C"/>
+            <w:u w:val="single"/>
+          </w:rPr>
+          <w:t>Link</w:t>
+        </w:r>
+      </w:hyperlink>
     </w:p>
     <w:p>
       <w:pPr>
@@ -818,16 +850,12 @@
       <w:r>
         <w:t>, “</w:t>
       </w:r>
-      <w:hyperlink r:id="rId16">
-        <w:r>
-          <w:rPr>
-            <w:color w:val="18324A"/>
-            <w:u w:val="single"/>
-            <w:i w:val="true"/>
-          </w:rPr>
-          <w:t>Suspended thin-film lithium niobate modulator for broadband mid-infrared light modulation and frequency comb generation</w:t>
-        </w:r>
-      </w:hyperlink>
+      <w:r>
+        <w:rPr>
+          <w:i/>
+        </w:rPr>
+        <w:t>Suspended thin-film lithium niobate modulator for broadband mid-infrared light modulation and frequency comb generation</w:t>
+      </w:r>
       <w:r>
         <w:t xml:space="preserve">.” </w:t>
       </w:r>
@@ -848,6 +876,18 @@
         </w:rPr>
         <w:t>IN PRESS</w:t>
       </w:r>
+      <w:r>
+        <w:t xml:space="preserve">  ·  </w:t>
+      </w:r>
+      <w:hyperlink r:id="rId16">
+        <w:r>
+          <w:rPr>
+            <w:color w:val="79933C"/>
+            <w:u w:val="single"/>
+          </w:rPr>
+          <w:t>Link</w:t>
+        </w:r>
+      </w:hyperlink>
     </w:p>
     <w:p>
       <w:pPr>
@@ -870,16 +910,12 @@
       <w:r>
         <w:t>, “</w:t>
       </w:r>
-      <w:hyperlink r:id="rId17">
-        <w:r>
-          <w:rPr>
-            <w:color w:val="18324A"/>
-            <w:u w:val="single"/>
-            <w:i w:val="true"/>
-          </w:rPr>
-          <w:t>Room-temperature low-noise optomechanical platform on thin-film lithium niobate</w:t>
-        </w:r>
-      </w:hyperlink>
+      <w:r>
+        <w:rPr>
+          <w:i/>
+        </w:rPr>
+        <w:t>Room-temperature low-noise optomechanical platform on thin-film lithium niobate</w:t>
+      </w:r>
       <w:r>
         <w:t xml:space="preserve">.” </w:t>
       </w:r>
@@ -900,6 +936,18 @@
         </w:rPr>
         <w:t>IN PRESS</w:t>
       </w:r>
+      <w:r>
+        <w:t xml:space="preserve">  ·  </w:t>
+      </w:r>
+      <w:hyperlink r:id="rId17">
+        <w:r>
+          <w:rPr>
+            <w:color w:val="79933C"/>
+            <w:u w:val="single"/>
+          </w:rPr>
+          <w:t>Link</w:t>
+        </w:r>
+      </w:hyperlink>
     </w:p>
     <w:p>
       <w:pPr>
@@ -925,16 +973,12 @@
       <w:r>
         <w:t>, “</w:t>
       </w:r>
-      <w:hyperlink r:id="rId18">
-        <w:r>
-          <w:rPr>
-            <w:color w:val="18324A"/>
-            <w:u w:val="single"/>
-            <w:i w:val="true"/>
-          </w:rPr>
-          <w:t>Fundamental phase noise in thin-film lithium niobate resonators</w:t>
-        </w:r>
-      </w:hyperlink>
+      <w:r>
+        <w:rPr>
+          <w:i/>
+        </w:rPr>
+        <w:t>Fundamental phase noise in thin-film lithium niobate resonators</w:t>
+      </w:r>
       <w:r>
         <w:t xml:space="preserve">.” </w:t>
       </w:r>
@@ -944,6 +988,18 @@
         </w:rPr>
         <w:t>Laser &amp; Photonics Reviews, e71681, 2025</w:t>
       </w:r>
+      <w:r>
+        <w:t xml:space="preserve">  ·  </w:t>
+      </w:r>
+      <w:hyperlink r:id="rId18">
+        <w:r>
+          <w:rPr>
+            <w:color w:val="79933C"/>
+            <w:u w:val="single"/>
+          </w:rPr>
+          <w:t>Link</w:t>
+        </w:r>
+      </w:hyperlink>
     </w:p>
     <w:p>
       <w:pPr>
@@ -969,16 +1025,12 @@
       <w:r>
         <w:t>, “</w:t>
       </w:r>
-      <w:hyperlink r:id="rId19">
-        <w:r>
-          <w:rPr>
-            <w:color w:val="18324A"/>
-            <w:u w:val="single"/>
-            <w:i w:val="true"/>
-          </w:rPr>
-          <w:t>Suspended, polarization-dependent, subwavelength-perforated metal absorber for mid-infrared bolometry</w:t>
-        </w:r>
-      </w:hyperlink>
+      <w:r>
+        <w:rPr>
+          <w:i/>
+        </w:rPr>
+        <w:t>Suspended, polarization-dependent, subwavelength-perforated metal absorber for mid-infrared bolometry</w:t>
+      </w:r>
       <w:r>
         <w:t xml:space="preserve">.” </w:t>
       </w:r>
@@ -988,6 +1040,18 @@
         </w:rPr>
         <w:t>Nano Letters 25(42), 15182–15188, 2025</w:t>
       </w:r>
+      <w:r>
+        <w:t xml:space="preserve">  ·  </w:t>
+      </w:r>
+      <w:hyperlink r:id="rId19">
+        <w:r>
+          <w:rPr>
+            <w:color w:val="79933C"/>
+            <w:u w:val="single"/>
+          </w:rPr>
+          <w:t>Link</w:t>
+        </w:r>
+      </w:hyperlink>
     </w:p>
     <w:p>
       <w:pPr>
@@ -1013,16 +1077,12 @@
       <w:r>
         <w:t>, “</w:t>
       </w:r>
-      <w:hyperlink r:id="rId20">
-        <w:r>
-          <w:rPr>
-            <w:color w:val="18324A"/>
-            <w:u w:val="single"/>
-            <w:i w:val="true"/>
-          </w:rPr>
-          <w:t>Hypermultiplexed integrated photonics–based optical tensor processor</w:t>
-        </w:r>
-      </w:hyperlink>
+      <w:r>
+        <w:rPr>
+          <w:i/>
+        </w:rPr>
+        <w:t>Hypermultiplexed integrated photonics–based optical tensor processor</w:t>
+      </w:r>
       <w:r>
         <w:t xml:space="preserve">.” </w:t>
       </w:r>
@@ -1032,6 +1092,18 @@
         </w:rPr>
         <w:t>Science Advances 11(23), eadu0228, 2025</w:t>
       </w:r>
+      <w:r>
+        <w:t xml:space="preserve">  ·  </w:t>
+      </w:r>
+      <w:hyperlink r:id="rId20">
+        <w:r>
+          <w:rPr>
+            <w:color w:val="79933C"/>
+            <w:u w:val="single"/>
+          </w:rPr>
+          <w:t>Link</w:t>
+        </w:r>
+      </w:hyperlink>
     </w:p>
     <w:p>
       <w:pPr>
@@ -1057,16 +1129,12 @@
       <w:r>
         <w:t>, “</w:t>
       </w:r>
-      <w:hyperlink r:id="rId21">
-        <w:r>
-          <w:rPr>
-            <w:color w:val="18324A"/>
-            <w:u w:val="single"/>
-            <w:i w:val="true"/>
-          </w:rPr>
-          <w:t>Photorefractive and pyroelectric photonic memory and long-term stability in thin-film lithium niobate microresonators</w:t>
-        </w:r>
-      </w:hyperlink>
+      <w:r>
+        <w:rPr>
+          <w:i/>
+        </w:rPr>
+        <w:t>Photorefractive and pyroelectric photonic memory and long-term stability in thin-film lithium niobate microresonators</w:t>
+      </w:r>
       <w:r>
         <w:t xml:space="preserve">.” </w:t>
       </w:r>
@@ -1076,6 +1144,18 @@
         </w:rPr>
         <w:t>npj Nanophotonics 2, 1, 2025</w:t>
       </w:r>
+      <w:r>
+        <w:t xml:space="preserve">  ·  </w:t>
+      </w:r>
+      <w:hyperlink r:id="rId21">
+        <w:r>
+          <w:rPr>
+            <w:color w:val="79933C"/>
+            <w:u w:val="single"/>
+          </w:rPr>
+          <w:t>Link</w:t>
+        </w:r>
+      </w:hyperlink>
     </w:p>
     <w:p>
       <w:pPr>
@@ -1098,16 +1178,12 @@
       <w:r>
         <w:t>, “</w:t>
       </w:r>
-      <w:hyperlink r:id="rId22">
-        <w:r>
-          <w:rPr>
-            <w:color w:val="18324A"/>
-            <w:u w:val="single"/>
-            <w:i w:val="true"/>
-          </w:rPr>
-          <w:t>Surface acoustic microwave photonic filters on an etchless lithium niobate integrated platform</w:t>
-        </w:r>
-      </w:hyperlink>
+      <w:r>
+        <w:rPr>
+          <w:i/>
+        </w:rPr>
+        <w:t>Surface acoustic microwave photonic filters on an etchless lithium niobate integrated platform</w:t>
+      </w:r>
       <w:r>
         <w:t xml:space="preserve">.” </w:t>
       </w:r>
@@ -1117,6 +1193,18 @@
         </w:rPr>
         <w:t>Laser &amp; Photonics Reviews 18(8), 2300385, 2024</w:t>
       </w:r>
+      <w:r>
+        <w:t xml:space="preserve">  ·  </w:t>
+      </w:r>
+      <w:hyperlink r:id="rId22">
+        <w:r>
+          <w:rPr>
+            <w:color w:val="79933C"/>
+            <w:u w:val="single"/>
+          </w:rPr>
+          <w:t>Link</w:t>
+        </w:r>
+      </w:hyperlink>
     </w:p>
     <w:p>
       <w:pPr>
@@ -1139,16 +1227,12 @@
       <w:r>
         <w:t>, “</w:t>
       </w:r>
-      <w:hyperlink r:id="rId23">
-        <w:r>
-          <w:rPr>
-            <w:color w:val="18324A"/>
-            <w:u w:val="single"/>
-            <w:i w:val="true"/>
-          </w:rPr>
-          <w:t>Etchless photonic integrated circuits enabled by bound states in the continuum: tutorial</w:t>
-        </w:r>
-      </w:hyperlink>
+      <w:r>
+        <w:rPr>
+          <w:i/>
+        </w:rPr>
+        <w:t>Etchless photonic integrated circuits enabled by bound states in the continuum: tutorial</w:t>
+      </w:r>
       <w:r>
         <w:t xml:space="preserve">.” </w:t>
       </w:r>
@@ -1169,6 +1253,18 @@
         </w:rPr>
         <w:t>TUTORIAL</w:t>
       </w:r>
+      <w:r>
+        <w:t xml:space="preserve">  ·  </w:t>
+      </w:r>
+      <w:hyperlink r:id="rId23">
+        <w:r>
+          <w:rPr>
+            <w:color w:val="79933C"/>
+            <w:u w:val="single"/>
+          </w:rPr>
+          <w:t>Link</w:t>
+        </w:r>
+      </w:hyperlink>
     </w:p>
     <w:p>
       <w:pPr>
@@ -1194,16 +1290,12 @@
       <w:r>
         <w:t>, “</w:t>
       </w:r>
-      <w:hyperlink r:id="rId24">
-        <w:r>
-          <w:rPr>
-            <w:color w:val="18324A"/>
-            <w:u w:val="single"/>
-            <w:i w:val="true"/>
-          </w:rPr>
-          <w:t>Fundamentals and applications of photonic waveguides with bound states in the continuum</w:t>
-        </w:r>
-      </w:hyperlink>
+      <w:r>
+        <w:rPr>
+          <w:i/>
+        </w:rPr>
+        <w:t>Fundamentals and applications of photonic waveguides with bound states in the continuum</w:t>
+      </w:r>
       <w:r>
         <w:t xml:space="preserve">.” </w:t>
       </w:r>
@@ -1213,6 +1305,18 @@
         </w:rPr>
         <w:t>Journal of Semiconductors 44(10), 101301, 2023</w:t>
       </w:r>
+      <w:r>
+        <w:t xml:space="preserve">  ·  </w:t>
+      </w:r>
+      <w:hyperlink r:id="rId24">
+        <w:r>
+          <w:rPr>
+            <w:color w:val="79933C"/>
+            <w:u w:val="single"/>
+          </w:rPr>
+          <w:t>Link</w:t>
+        </w:r>
+      </w:hyperlink>
     </w:p>
     <w:p>
       <w:pPr>
@@ -1238,16 +1342,12 @@
       <w:r>
         <w:t>, “</w:t>
       </w:r>
-      <w:hyperlink r:id="rId25">
-        <w:r>
-          <w:rPr>
-            <w:color w:val="18324A"/>
-            <w:u w:val="single"/>
-            <w:i w:val="true"/>
-          </w:rPr>
-          <w:t>Coupling of photon emitters in monolayer WS₂ with a photonic waveguide based on bound states in the continuum</w:t>
-        </w:r>
-      </w:hyperlink>
+      <w:r>
+        <w:rPr>
+          <w:i/>
+        </w:rPr>
+        <w:t>Coupling of photon emitters in monolayer WS₂ with a photonic waveguide based on bound states in the continuum</w:t>
+      </w:r>
       <w:r>
         <w:t xml:space="preserve">.” </w:t>
       </w:r>
@@ -1257,6 +1357,18 @@
         </w:rPr>
         <w:t>Nano Letters 23(8), 3209–3216, 2023</w:t>
       </w:r>
+      <w:r>
+        <w:t xml:space="preserve">  ·  </w:t>
+      </w:r>
+      <w:hyperlink r:id="rId25">
+        <w:r>
+          <w:rPr>
+            <w:color w:val="79933C"/>
+            <w:u w:val="single"/>
+          </w:rPr>
+          <w:t>Link</w:t>
+        </w:r>
+      </w:hyperlink>
     </w:p>
     <w:p>
       <w:pPr>
@@ -1282,16 +1394,12 @@
       <w:r>
         <w:t>, “</w:t>
       </w:r>
-      <w:hyperlink r:id="rId26">
-        <w:r>
-          <w:rPr>
-            <w:color w:val="18324A"/>
-            <w:u w:val="single"/>
-            <w:i w:val="true"/>
-          </w:rPr>
-          <w:t>Inverse-designed linear coherent photonic networks for high-resolution spectral reconstruction</w:t>
-        </w:r>
-      </w:hyperlink>
+      <w:r>
+        <w:rPr>
+          <w:i/>
+        </w:rPr>
+        <w:t>Inverse-designed linear coherent photonic networks for high-resolution spectral reconstruction</w:t>
+      </w:r>
       <w:r>
         <w:t xml:space="preserve">.” </w:t>
       </w:r>
@@ -1312,6 +1420,18 @@
         </w:rPr>
         <w:t>COVER ARTICLE</w:t>
       </w:r>
+      <w:r>
+        <w:t xml:space="preserve">  ·  </w:t>
+      </w:r>
+      <w:hyperlink r:id="rId26">
+        <w:r>
+          <w:rPr>
+            <w:color w:val="79933C"/>
+            <w:u w:val="single"/>
+          </w:rPr>
+          <w:t>Link</w:t>
+        </w:r>
+      </w:hyperlink>
     </w:p>
     <w:p>
       <w:pPr>
@@ -1337,16 +1457,12 @@
       <w:r>
         <w:t>, “</w:t>
       </w:r>
-      <w:hyperlink r:id="rId27">
-        <w:r>
-          <w:rPr>
-            <w:color w:val="18324A"/>
-            <w:u w:val="single"/>
-            <w:i w:val="true"/>
-          </w:rPr>
-          <w:t>Neural optimizer for inverse design of complex-modulated holograms implemented by plasmonic metasurfaces</w:t>
-        </w:r>
-      </w:hyperlink>
+      <w:r>
+        <w:rPr>
+          <w:i/>
+        </w:rPr>
+        <w:t>Neural optimizer for inverse design of complex-modulated holograms implemented by plasmonic metasurfaces</w:t>
+      </w:r>
       <w:r>
         <w:t xml:space="preserve">.” </w:t>
       </w:r>
@@ -1356,6 +1472,18 @@
         </w:rPr>
         <w:t>Advanced Photonics Research 4(1), 2200085, 2023</w:t>
       </w:r>
+      <w:r>
+        <w:t xml:space="preserve">  ·  </w:t>
+      </w:r>
+      <w:hyperlink r:id="rId27">
+        <w:r>
+          <w:rPr>
+            <w:color w:val="79933C"/>
+            <w:u w:val="single"/>
+          </w:rPr>
+          <w:t>Link</w:t>
+        </w:r>
+      </w:hyperlink>
     </w:p>
     <w:p>
       <w:pPr>
@@ -1378,16 +1506,12 @@
       <w:r>
         <w:t>, “</w:t>
       </w:r>
-      <w:hyperlink r:id="rId28">
-        <w:r>
-          <w:rPr>
-            <w:color w:val="18324A"/>
-            <w:u w:val="single"/>
-            <w:i w:val="true"/>
-          </w:rPr>
-          <w:t>Observation of mechanical bound states in the continuum in an optomechanical microresonator</w:t>
-        </w:r>
-      </w:hyperlink>
+      <w:r>
+        <w:rPr>
+          <w:i/>
+        </w:rPr>
+        <w:t>Observation of mechanical bound states in the continuum in an optomechanical microresonator</w:t>
+      </w:r>
       <w:r>
         <w:t xml:space="preserve">.” </w:t>
       </w:r>
@@ -1397,6 +1521,18 @@
         </w:rPr>
         <w:t>Light: Science &amp; Applications 11, 328, 2022</w:t>
       </w:r>
+      <w:r>
+        <w:t xml:space="preserve">  ·  </w:t>
+      </w:r>
+      <w:hyperlink r:id="rId28">
+        <w:r>
+          <w:rPr>
+            <w:color w:val="79933C"/>
+            <w:u w:val="single"/>
+          </w:rPr>
+          <w:t>Link</w:t>
+        </w:r>
+      </w:hyperlink>
     </w:p>
     <w:p>
       <w:pPr>
@@ -1419,16 +1555,12 @@
       <w:r>
         <w:t>, “</w:t>
       </w:r>
-      <w:hyperlink r:id="rId29">
-        <w:r>
-          <w:rPr>
-            <w:color w:val="18324A"/>
-            <w:u w:val="single"/>
-            <w:i w:val="true"/>
-          </w:rPr>
-          <w:t>Wavelength-division multiplexing on an etchless lithium niobate integrated platform</w:t>
-        </w:r>
-      </w:hyperlink>
+      <w:r>
+        <w:rPr>
+          <w:i/>
+        </w:rPr>
+        <w:t>Wavelength-division multiplexing on an etchless lithium niobate integrated platform</w:t>
+      </w:r>
       <w:r>
         <w:t xml:space="preserve">.” </w:t>
       </w:r>
@@ -1438,6 +1570,18 @@
         </w:rPr>
         <w:t>ACS Photonics 9(10), 3253–3259, 2022</w:t>
       </w:r>
+      <w:r>
+        <w:t xml:space="preserve">  ·  </w:t>
+      </w:r>
+      <w:hyperlink r:id="rId29">
+        <w:r>
+          <w:rPr>
+            <w:color w:val="79933C"/>
+            <w:u w:val="single"/>
+          </w:rPr>
+          <w:t>Link</w:t>
+        </w:r>
+      </w:hyperlink>
     </w:p>
     <w:p>
       <w:pPr>
@@ -1463,16 +1607,12 @@
       <w:r>
         <w:t>, “</w:t>
       </w:r>
-      <w:hyperlink r:id="rId30">
-        <w:r>
-          <w:rPr>
-            <w:color w:val="18324A"/>
-            <w:u w:val="single"/>
-            <w:i w:val="true"/>
-          </w:rPr>
-          <w:t>Second-harmonic generation in etchless lithium niobate nanophotonic waveguides with bound states in the continuum</w:t>
-        </w:r>
-      </w:hyperlink>
+      <w:r>
+        <w:rPr>
+          <w:i/>
+        </w:rPr>
+        <w:t>Second-harmonic generation in etchless lithium niobate nanophotonic waveguides with bound states in the continuum</w:t>
+      </w:r>
       <w:r>
         <w:t xml:space="preserve">.” </w:t>
       </w:r>
@@ -1482,6 +1622,18 @@
         </w:rPr>
         <w:t>Laser &amp; Photonics Reviews 16(3), 2100429, 2022</w:t>
       </w:r>
+      <w:r>
+        <w:t xml:space="preserve">  ·  </w:t>
+      </w:r>
+      <w:hyperlink r:id="rId30">
+        <w:r>
+          <w:rPr>
+            <w:color w:val="79933C"/>
+            <w:u w:val="single"/>
+          </w:rPr>
+          <w:t>Link</w:t>
+        </w:r>
+      </w:hyperlink>
     </w:p>
     <w:p>
       <w:pPr>
@@ -1504,16 +1656,12 @@
       <w:r>
         <w:t>, “</w:t>
       </w:r>
-      <w:hyperlink r:id="rId31">
-        <w:r>
-          <w:rPr>
-            <w:color w:val="18324A"/>
-            <w:u w:val="single"/>
-            <w:i w:val="true"/>
-          </w:rPr>
-          <w:t>Demonstration of on-chip gigahertz acousto-optic modulation at near-visible wavelengths</w:t>
-        </w:r>
-      </w:hyperlink>
+      <w:r>
+        <w:rPr>
+          <w:i/>
+        </w:rPr>
+        <w:t>Demonstration of on-chip gigahertz acousto-optic modulation at near-visible wavelengths</w:t>
+      </w:r>
       <w:r>
         <w:t xml:space="preserve">.” </w:t>
       </w:r>
@@ -1523,6 +1671,18 @@
         </w:rPr>
         <w:t>Nanophotonics 10(17), 4323–4329, 2021</w:t>
       </w:r>
+      <w:r>
+        <w:t xml:space="preserve">  ·  </w:t>
+      </w:r>
+      <w:hyperlink r:id="rId31">
+        <w:r>
+          <w:rPr>
+            <w:color w:val="79933C"/>
+            <w:u w:val="single"/>
+          </w:rPr>
+          <w:t>Link</w:t>
+        </w:r>
+      </w:hyperlink>
     </w:p>
     <w:p>
       <w:pPr>
@@ -1545,16 +1705,12 @@
       <w:r>
         <w:t>, “</w:t>
       </w:r>
-      <w:hyperlink r:id="rId32">
-        <w:r>
-          <w:rPr>
-            <w:color w:val="18324A"/>
-            <w:u w:val="single"/>
-            <w:i w:val="true"/>
-          </w:rPr>
-          <w:t>Ultralow-loss etchless lithium niobate integrated photonics at near-visible wavelengths</w:t>
-        </w:r>
-      </w:hyperlink>
+      <w:r>
+        <w:rPr>
+          <w:i/>
+        </w:rPr>
+        <w:t>Ultralow-loss etchless lithium niobate integrated photonics at near-visible wavelengths</w:t>
+      </w:r>
       <w:r>
         <w:t xml:space="preserve">.” </w:t>
       </w:r>
@@ -1564,6 +1720,18 @@
         </w:rPr>
         <w:t>Advanced Optical Materials 9(19), 2100060, 2021</w:t>
       </w:r>
+      <w:r>
+        <w:t xml:space="preserve">  ·  </w:t>
+      </w:r>
+      <w:hyperlink r:id="rId32">
+        <w:r>
+          <w:rPr>
+            <w:color w:val="79933C"/>
+            <w:u w:val="single"/>
+          </w:rPr>
+          <w:t>Link</w:t>
+        </w:r>
+      </w:hyperlink>
     </w:p>
     <w:p>
       <w:pPr>
@@ -1589,16 +1757,12 @@
       <w:r>
         <w:t>, “</w:t>
       </w:r>
-      <w:hyperlink r:id="rId33">
-        <w:r>
-          <w:rPr>
-            <w:color w:val="18324A"/>
-            <w:u w:val="single"/>
-            <w:i w:val="true"/>
-          </w:rPr>
-          <w:t>Broadband meta-converters for multiple Laguerre–Gaussian modes</w:t>
-        </w:r>
-      </w:hyperlink>
+      <w:r>
+        <w:rPr>
+          <w:i/>
+        </w:rPr>
+        <w:t>Broadband meta-converters for multiple Laguerre–Gaussian modes</w:t>
+      </w:r>
       <w:r>
         <w:t xml:space="preserve">.” </w:t>
       </w:r>
@@ -1608,6 +1772,18 @@
         </w:rPr>
         <w:t>Photonics Research 9(9), 1689–1698, 2021</w:t>
       </w:r>
+      <w:r>
+        <w:t xml:space="preserve">  ·  </w:t>
+      </w:r>
+      <w:hyperlink r:id="rId33">
+        <w:r>
+          <w:rPr>
+            <w:color w:val="79933C"/>
+            <w:u w:val="single"/>
+          </w:rPr>
+          <w:t>Link</w:t>
+        </w:r>
+      </w:hyperlink>
     </w:p>
     <w:p>
       <w:pPr>
@@ -1630,16 +1806,12 @@
       <w:r>
         <w:t>, “</w:t>
       </w:r>
-      <w:hyperlink r:id="rId34">
-        <w:r>
-          <w:rPr>
-            <w:color w:val="18324A"/>
-            <w:u w:val="single"/>
-            <w:i w:val="true"/>
-          </w:rPr>
-          <w:t>Nonmetallic broadband visible-light absorbers with polarization and incident-angle insensitivity</w:t>
-        </w:r>
-      </w:hyperlink>
+      <w:r>
+        <w:rPr>
+          <w:i/>
+        </w:rPr>
+        <w:t>Nonmetallic broadband visible-light absorbers with polarization and incident-angle insensitivity</w:t>
+      </w:r>
       <w:r>
         <w:t xml:space="preserve">.” </w:t>
       </w:r>
@@ -1649,6 +1821,18 @@
         </w:rPr>
         <w:t>IEEE Photonics Journal 12(6), 2200807, 2020</w:t>
       </w:r>
+      <w:r>
+        <w:t xml:space="preserve">  ·  </w:t>
+      </w:r>
+      <w:hyperlink r:id="rId34">
+        <w:r>
+          <w:rPr>
+            <w:color w:val="79933C"/>
+            <w:u w:val="single"/>
+          </w:rPr>
+          <w:t>Link</w:t>
+        </w:r>
+      </w:hyperlink>
     </w:p>
     <w:p>
       <w:pPr>
@@ -1697,16 +1881,12 @@
       <w:r>
         <w:t>, “</w:t>
       </w:r>
-      <w:hyperlink r:id="rId35">
-        <w:r>
-          <w:rPr>
-            <w:color w:val="18324A"/>
-            <w:u w:val="single"/>
-            <w:i w:val="true"/>
-          </w:rPr>
-          <w:t>Monolithic room-temperature mid-infrared detector based on a thin-film lithium niobate optomechanical resonator</w:t>
-        </w:r>
-      </w:hyperlink>
+      <w:r>
+        <w:rPr>
+          <w:i/>
+        </w:rPr>
+        <w:t>Monolithic room-temperature mid-infrared detector based on a thin-film lithium niobate optomechanical resonator</w:t>
+      </w:r>
       <w:r>
         <w:t xml:space="preserve">.” </w:t>
       </w:r>
@@ -1716,6 +1896,18 @@
         </w:rPr>
         <w:t>CLEO: Science and Innovations, paper STh4C.6, 2026</w:t>
       </w:r>
+      <w:r>
+        <w:t xml:space="preserve">  ·  </w:t>
+      </w:r>
+      <w:hyperlink r:id="rId35">
+        <w:r>
+          <w:rPr>
+            <w:color w:val="79933C"/>
+            <w:u w:val="single"/>
+          </w:rPr>
+          <w:t>Link</w:t>
+        </w:r>
+      </w:hyperlink>
     </w:p>
     <w:p>
       <w:pPr>
@@ -1741,16 +1933,12 @@
       <w:r>
         <w:t>, “</w:t>
       </w:r>
-      <w:hyperlink r:id="rId36">
-        <w:r>
-          <w:rPr>
-            <w:color w:val="18324A"/>
-            <w:u w:val="single"/>
-            <w:i w:val="true"/>
-          </w:rPr>
-          <w:t>Vacuum squeezing in adaptively poled lithium niobate nanowaveguides</w:t>
-        </w:r>
-      </w:hyperlink>
+      <w:r>
+        <w:rPr>
+          <w:i/>
+        </w:rPr>
+        <w:t>Vacuum squeezing in adaptively poled lithium niobate nanowaveguides</w:t>
+      </w:r>
       <w:r>
         <w:t xml:space="preserve">.” </w:t>
       </w:r>
@@ -1771,6 +1959,18 @@
         </w:rPr>
         <w:t>POSTDEADLINE</w:t>
       </w:r>
+      <w:r>
+        <w:t xml:space="preserve">  ·  </w:t>
+      </w:r>
+      <w:hyperlink r:id="rId36">
+        <w:r>
+          <w:rPr>
+            <w:color w:val="79933C"/>
+            <w:u w:val="single"/>
+          </w:rPr>
+          <w:t>Link</w:t>
+        </w:r>
+      </w:hyperlink>
     </w:p>
     <w:p>
       <w:pPr>
@@ -1796,16 +1996,12 @@
       <w:r>
         <w:t>, “</w:t>
       </w:r>
-      <w:hyperlink r:id="rId37">
-        <w:r>
-          <w:rPr>
-            <w:color w:val="18324A"/>
-            <w:u w:val="single"/>
-            <w:i w:val="true"/>
-          </w:rPr>
-          <w:t>Opto-electro-mechanical oscillator on thin-film lithium niobate</w:t>
-        </w:r>
-      </w:hyperlink>
+      <w:r>
+        <w:rPr>
+          <w:i/>
+        </w:rPr>
+        <w:t>Opto-electro-mechanical oscillator on thin-film lithium niobate</w:t>
+      </w:r>
       <w:r>
         <w:t xml:space="preserve">.” </w:t>
       </w:r>
@@ -1815,6 +2011,18 @@
         </w:rPr>
         <w:t>CLEO: Science and Innovations, paper SM1A.2, 2026</w:t>
       </w:r>
+      <w:r>
+        <w:t xml:space="preserve">  ·  </w:t>
+      </w:r>
+      <w:hyperlink r:id="rId37">
+        <w:r>
+          <w:rPr>
+            <w:color w:val="79933C"/>
+            <w:u w:val="single"/>
+          </w:rPr>
+          <w:t>Link</w:t>
+        </w:r>
+      </w:hyperlink>
     </w:p>
     <w:p>
       <w:pPr>
@@ -1840,16 +2048,12 @@
       <w:r>
         <w:t>, “</w:t>
       </w:r>
-      <w:hyperlink r:id="rId38">
-        <w:r>
-          <w:rPr>
-            <w:color w:val="18324A"/>
-            <w:u w:val="single"/>
-            <w:i w:val="true"/>
-          </w:rPr>
-          <w:t>Suspended subwavelength-perforated metal absorber for mid-infrared bolometry</w:t>
-        </w:r>
-      </w:hyperlink>
+      <w:r>
+        <w:rPr>
+          <w:i/>
+        </w:rPr>
+        <w:t>Suspended subwavelength-perforated metal absorber for mid-infrared bolometry</w:t>
+      </w:r>
       <w:r>
         <w:t xml:space="preserve">.” </w:t>
       </w:r>
@@ -1859,6 +2063,18 @@
         </w:rPr>
         <w:t>CLEO, 2025</w:t>
       </w:r>
+      <w:r>
+        <w:t xml:space="preserve">  ·  </w:t>
+      </w:r>
+      <w:hyperlink r:id="rId38">
+        <w:r>
+          <w:rPr>
+            <w:color w:val="79933C"/>
+            <w:u w:val="single"/>
+          </w:rPr>
+          <w:t>Link</w:t>
+        </w:r>
+      </w:hyperlink>
     </w:p>
     <w:p>
       <w:pPr>
@@ -1884,16 +2100,12 @@
       <w:r>
         <w:t>, “</w:t>
       </w:r>
-      <w:hyperlink r:id="rId39">
-        <w:r>
-          <w:rPr>
-            <w:color w:val="18324A"/>
-            <w:u w:val="single"/>
-            <w:i w:val="true"/>
-          </w:rPr>
-          <w:t>Few-cycle pulse generation on the thin-film lithium niobate platform</w:t>
-        </w:r>
-      </w:hyperlink>
+      <w:r>
+        <w:rPr>
+          <w:i/>
+        </w:rPr>
+        <w:t>Few-cycle pulse generation on the thin-film lithium niobate platform</w:t>
+      </w:r>
       <w:r>
         <w:t xml:space="preserve">.” </w:t>
       </w:r>
@@ -1903,6 +2115,18 @@
         </w:rPr>
         <w:t>CLEO, paper SS150_3, 2025</w:t>
       </w:r>
+      <w:r>
+        <w:t xml:space="preserve">  ·  </w:t>
+      </w:r>
+      <w:hyperlink r:id="rId39">
+        <w:r>
+          <w:rPr>
+            <w:color w:val="79933C"/>
+            <w:u w:val="single"/>
+          </w:rPr>
+          <w:t>Link</w:t>
+        </w:r>
+      </w:hyperlink>
     </w:p>
     <w:p>
       <w:pPr>
@@ -1928,16 +2152,12 @@
       <w:r>
         <w:t>, “</w:t>
       </w:r>
-      <w:hyperlink r:id="rId40">
-        <w:r>
-          <w:rPr>
-            <w:color w:val="18324A"/>
-            <w:u w:val="single"/>
-            <w:i w:val="true"/>
-          </w:rPr>
-          <w:t>Intrinsic frequency noise of thin-film lithium niobate platforms</w:t>
-        </w:r>
-      </w:hyperlink>
+      <w:r>
+        <w:rPr>
+          <w:i/>
+        </w:rPr>
+        <w:t>Intrinsic frequency noise of thin-film lithium niobate platforms</w:t>
+      </w:r>
       <w:r>
         <w:t xml:space="preserve">.” </w:t>
       </w:r>
@@ -1947,6 +2167,18 @@
         </w:rPr>
         <w:t>CLEO, paper SS140_4, 2025</w:t>
       </w:r>
+      <w:r>
+        <w:t xml:space="preserve">  ·  </w:t>
+      </w:r>
+      <w:hyperlink r:id="rId40">
+        <w:r>
+          <w:rPr>
+            <w:color w:val="79933C"/>
+            <w:u w:val="single"/>
+          </w:rPr>
+          <w:t>Link</w:t>
+        </w:r>
+      </w:hyperlink>
     </w:p>
     <w:p>
       <w:pPr>
@@ -1969,16 +2201,12 @@
       <w:r>
         <w:t>, “</w:t>
       </w:r>
-      <w:hyperlink r:id="rId41">
-        <w:r>
-          <w:rPr>
-            <w:color w:val="18324A"/>
-            <w:u w:val="single"/>
-            <w:i w:val="true"/>
-          </w:rPr>
-          <w:t>Room-temperature optomechanical-resonator-based thermal sensor on thin-film lithium niobate</w:t>
-        </w:r>
-      </w:hyperlink>
+      <w:r>
+        <w:rPr>
+          <w:i/>
+        </w:rPr>
+        <w:t>Room-temperature optomechanical-resonator-based thermal sensor on thin-film lithium niobate</w:t>
+      </w:r>
       <w:r>
         <w:t xml:space="preserve">.” </w:t>
       </w:r>
@@ -1988,6 +2216,18 @@
         </w:rPr>
         <w:t>CLEO, paper SS190_1, 2025</w:t>
       </w:r>
+      <w:r>
+        <w:t xml:space="preserve">  ·  </w:t>
+      </w:r>
+      <w:hyperlink r:id="rId41">
+        <w:r>
+          <w:rPr>
+            <w:color w:val="79933C"/>
+            <w:u w:val="single"/>
+          </w:rPr>
+          <w:t>Link</w:t>
+        </w:r>
+      </w:hyperlink>
     </w:p>
     <w:p>
       <w:pPr>
@@ -2013,16 +2253,12 @@
       <w:r>
         <w:t>, “</w:t>
       </w:r>
-      <w:hyperlink r:id="rId42">
-        <w:r>
-          <w:rPr>
-            <w:color w:val="18324A"/>
-            <w:u w:val="single"/>
-            <w:i w:val="true"/>
-          </w:rPr>
-          <w:t>Mid-wavelength infrared IM/DD communications using an air-suspended thin-film lithium niobate intensity modulator</w:t>
-        </w:r>
-      </w:hyperlink>
+      <w:r>
+        <w:rPr>
+          <w:i/>
+        </w:rPr>
+        <w:t>Mid-wavelength infrared IM/DD communications using an air-suspended thin-film lithium niobate intensity modulator</w:t>
+      </w:r>
       <w:r>
         <w:t xml:space="preserve">.” </w:t>
       </w:r>
@@ -2032,6 +2268,18 @@
         </w:rPr>
         <w:t>Optical Fiber Communication Conference, paper Th3J.1, 2025</w:t>
       </w:r>
+      <w:r>
+        <w:t xml:space="preserve">  ·  </w:t>
+      </w:r>
+      <w:hyperlink r:id="rId42">
+        <w:r>
+          <w:rPr>
+            <w:color w:val="79933C"/>
+            <w:u w:val="single"/>
+          </w:rPr>
+          <w:t>Link</w:t>
+        </w:r>
+      </w:hyperlink>
     </w:p>
     <w:p>
       <w:pPr>
@@ -2057,16 +2305,12 @@
       <w:r>
         <w:t>, “</w:t>
       </w:r>
-      <w:hyperlink r:id="rId43">
-        <w:r>
-          <w:rPr>
-            <w:color w:val="18324A"/>
-            <w:u w:val="single"/>
-            <w:i w:val="true"/>
-          </w:rPr>
-          <w:t>Lithium niobate chip-based ultrafast optical signal processor</w:t>
-        </w:r>
-      </w:hyperlink>
+      <w:r>
+        <w:rPr>
+          <w:i/>
+        </w:rPr>
+        <w:t>Lithium niobate chip-based ultrafast optical signal processor</w:t>
+      </w:r>
       <w:r>
         <w:t xml:space="preserve">.” </w:t>
       </w:r>
@@ -2076,6 +2320,18 @@
         </w:rPr>
         <w:t>CLEO, paper SM4L.5, 2024</w:t>
       </w:r>
+      <w:r>
+        <w:t xml:space="preserve">  ·  </w:t>
+      </w:r>
+      <w:hyperlink r:id="rId43">
+        <w:r>
+          <w:rPr>
+            <w:color w:val="79933C"/>
+            <w:u w:val="single"/>
+          </w:rPr>
+          <w:t>Link</w:t>
+        </w:r>
+      </w:hyperlink>
     </w:p>
     <w:p>
       <w:pPr>
@@ -2101,16 +2357,12 @@
       <w:r>
         <w:t>, “</w:t>
       </w:r>
-      <w:hyperlink r:id="rId44">
-        <w:r>
-          <w:rPr>
-            <w:color w:val="18324A"/>
-            <w:u w:val="single"/>
-            <w:i w:val="true"/>
-          </w:rPr>
-          <w:t>Long-lived photorefractive and pyroelectric effects in thin-film lithium niobate microresonators</w:t>
-        </w:r>
-      </w:hyperlink>
+      <w:r>
+        <w:rPr>
+          <w:i/>
+        </w:rPr>
+        <w:t>Long-lived photorefractive and pyroelectric effects in thin-film lithium niobate microresonators</w:t>
+      </w:r>
       <w:r>
         <w:t xml:space="preserve">.” </w:t>
       </w:r>
@@ -2120,6 +2372,18 @@
         </w:rPr>
         <w:t>CLEO, paper STu3E.1, 2024</w:t>
       </w:r>
+      <w:r>
+        <w:t xml:space="preserve">  ·  </w:t>
+      </w:r>
+      <w:hyperlink r:id="rId44">
+        <w:r>
+          <w:rPr>
+            <w:color w:val="79933C"/>
+            <w:u w:val="single"/>
+          </w:rPr>
+          <w:t>Link</w:t>
+        </w:r>
+      </w:hyperlink>
     </w:p>
     <w:p>
       <w:pPr>
@@ -2142,16 +2406,12 @@
       <w:r>
         <w:t>, “</w:t>
       </w:r>
-      <w:hyperlink r:id="rId22">
-        <w:r>
-          <w:rPr>
-            <w:color w:val="18324A"/>
-            <w:u w:val="single"/>
-            <w:i w:val="true"/>
-          </w:rPr>
-          <w:t>Surface acoustic microwave photonic filters on an etchless lithium niobate integrated platform</w:t>
-        </w:r>
-      </w:hyperlink>
+      <w:r>
+        <w:rPr>
+          <w:i/>
+        </w:rPr>
+        <w:t>Surface acoustic microwave photonic filters on an etchless lithium niobate integrated platform</w:t>
+      </w:r>
       <w:r>
         <w:t xml:space="preserve">.” </w:t>
       </w:r>
@@ -2161,6 +2421,18 @@
         </w:rPr>
         <w:t>CLEO, San Jose, California, 2023</w:t>
       </w:r>
+      <w:r>
+        <w:t xml:space="preserve">  ·  </w:t>
+      </w:r>
+      <w:hyperlink r:id="rId22">
+        <w:r>
+          <w:rPr>
+            <w:color w:val="79933C"/>
+            <w:u w:val="single"/>
+          </w:rPr>
+          <w:t>Link</w:t>
+        </w:r>
+      </w:hyperlink>
     </w:p>
     <w:p>
       <w:pPr>
@@ -2186,16 +2458,12 @@
       <w:r>
         <w:t>, “</w:t>
       </w:r>
-      <w:hyperlink r:id="rId26">
-        <w:r>
-          <w:rPr>
-            <w:color w:val="18324A"/>
-            <w:u w:val="single"/>
-            <w:i w:val="true"/>
-          </w:rPr>
-          <w:t>Inverse-designed linear coherent photonic networks for high-resolution spectral reconstruction</w:t>
-        </w:r>
-      </w:hyperlink>
+      <w:r>
+        <w:rPr>
+          <w:i/>
+        </w:rPr>
+        <w:t>Inverse-designed linear coherent photonic networks for high-resolution spectral reconstruction</w:t>
+      </w:r>
       <w:r>
         <w:t xml:space="preserve">.” </w:t>
       </w:r>
@@ -2205,6 +2473,18 @@
         </w:rPr>
         <w:t>CLEO, San Jose, California, 2023</w:t>
       </w:r>
+      <w:r>
+        <w:t xml:space="preserve">  ·  </w:t>
+      </w:r>
+      <w:hyperlink r:id="rId26">
+        <w:r>
+          <w:rPr>
+            <w:color w:val="79933C"/>
+            <w:u w:val="single"/>
+          </w:rPr>
+          <w:t>Link</w:t>
+        </w:r>
+      </w:hyperlink>
     </w:p>
     <w:p>
       <w:pPr>
@@ -2227,16 +2507,12 @@
       <w:r>
         <w:t>, “</w:t>
       </w:r>
-      <w:hyperlink r:id="rId28">
-        <w:r>
-          <w:rPr>
-            <w:color w:val="18324A"/>
-            <w:u w:val="single"/>
-            <w:i w:val="true"/>
-          </w:rPr>
-          <w:t>Observation of mechanical bound states in the continuum in an optomechanical microresonator</w:t>
-        </w:r>
-      </w:hyperlink>
+      <w:r>
+        <w:rPr>
+          <w:i/>
+        </w:rPr>
+        <w:t>Observation of mechanical bound states in the continuum in an optomechanical microresonator</w:t>
+      </w:r>
       <w:r>
         <w:t xml:space="preserve">.” </w:t>
       </w:r>
@@ -2257,6 +2533,18 @@
         </w:rPr>
         <w:t>POSTDEADLINE</w:t>
       </w:r>
+      <w:r>
+        <w:t xml:space="preserve">  ·  </w:t>
+      </w:r>
+      <w:hyperlink r:id="rId28">
+        <w:r>
+          <w:rPr>
+            <w:color w:val="79933C"/>
+            <w:u w:val="single"/>
+          </w:rPr>
+          <w:t>Link</w:t>
+        </w:r>
+      </w:hyperlink>
     </w:p>
     <w:p>
       <w:pPr>
@@ -2279,16 +2567,12 @@
       <w:r>
         <w:t>, “</w:t>
       </w:r>
-      <w:hyperlink r:id="rId29">
-        <w:r>
-          <w:rPr>
-            <w:color w:val="18324A"/>
-            <w:u w:val="single"/>
-            <w:i w:val="true"/>
-          </w:rPr>
-          <w:t>Wavelength-division multiplexing on an etchless lithium niobate integrated platform</w:t>
-        </w:r>
-      </w:hyperlink>
+      <w:r>
+        <w:rPr>
+          <w:i/>
+        </w:rPr>
+        <w:t>Wavelength-division multiplexing on an etchless lithium niobate integrated platform</w:t>
+      </w:r>
       <w:r>
         <w:t xml:space="preserve">.” </w:t>
       </w:r>
@@ -2298,6 +2582,18 @@
         </w:rPr>
         <w:t>Frontiers in Optics, Rochester, New York, 2022</w:t>
       </w:r>
+      <w:r>
+        <w:t xml:space="preserve">  ·  </w:t>
+      </w:r>
+      <w:hyperlink r:id="rId29">
+        <w:r>
+          <w:rPr>
+            <w:color w:val="79933C"/>
+            <w:u w:val="single"/>
+          </w:rPr>
+          <w:t>Link</w:t>
+        </w:r>
+      </w:hyperlink>
     </w:p>
     <w:p>
       <w:pPr>
@@ -2320,16 +2616,12 @@
       <w:r>
         <w:t>, “</w:t>
       </w:r>
-      <w:hyperlink r:id="rId32">
-        <w:r>
-          <w:rPr>
-            <w:color w:val="18324A"/>
-            <w:u w:val="single"/>
-            <w:i w:val="true"/>
-          </w:rPr>
-          <w:t>Ultralow-loss etchless lithium niobate integrated photonics at near-visible wavelengths</w:t>
-        </w:r>
-      </w:hyperlink>
+      <w:r>
+        <w:rPr>
+          <w:i/>
+        </w:rPr>
+        <w:t>Ultralow-loss etchless lithium niobate integrated photonics at near-visible wavelengths</w:t>
+      </w:r>
       <w:r>
         <w:t xml:space="preserve">.” </w:t>
       </w:r>
@@ -2339,6 +2631,18 @@
         </w:rPr>
         <w:t>CLEO, San Jose, California, 2022</w:t>
       </w:r>
+      <w:r>
+        <w:t xml:space="preserve">  ·  </w:t>
+      </w:r>
+      <w:hyperlink r:id="rId32">
+        <w:r>
+          <w:rPr>
+            <w:color w:val="79933C"/>
+            <w:u w:val="single"/>
+          </w:rPr>
+          <w:t>Link</w:t>
+        </w:r>
+      </w:hyperlink>
     </w:p>
     <w:p>
       <w:pPr>
@@ -2364,16 +2668,12 @@
       <w:r>
         <w:t>, “</w:t>
       </w:r>
-      <w:hyperlink r:id="rId30">
-        <w:r>
-          <w:rPr>
-            <w:color w:val="18324A"/>
-            <w:u w:val="single"/>
-            <w:i w:val="true"/>
-          </w:rPr>
-          <w:t>Second-harmonic generation in etchless lithium niobate nanophotonic waveguides with bound states in the continuum</w:t>
-        </w:r>
-      </w:hyperlink>
+      <w:r>
+        <w:rPr>
+          <w:i/>
+        </w:rPr>
+        <w:t>Second-harmonic generation in etchless lithium niobate nanophotonic waveguides with bound states in the continuum</w:t>
+      </w:r>
       <w:r>
         <w:t xml:space="preserve">.” </w:t>
       </w:r>
@@ -2383,6 +2683,18 @@
         </w:rPr>
         <w:t>CLEO, San Jose, California, 2022</w:t>
       </w:r>
+      <w:r>
+        <w:t xml:space="preserve">  ·  </w:t>
+      </w:r>
+      <w:hyperlink r:id="rId30">
+        <w:r>
+          <w:rPr>
+            <w:color w:val="79933C"/>
+            <w:u w:val="single"/>
+          </w:rPr>
+          <w:t>Link</w:t>
+        </w:r>
+      </w:hyperlink>
     </w:p>
     <w:p>
       <w:pPr>
@@ -2405,16 +2717,12 @@
       <w:r>
         <w:t>, “</w:t>
       </w:r>
-      <w:hyperlink r:id="rId45">
-        <w:r>
-          <w:rPr>
-            <w:color w:val="18324A"/>
-            <w:u w:val="single"/>
-            <w:i w:val="true"/>
-          </w:rPr>
-          <w:t>Etchless lithium niobate integrated photonics</w:t>
-        </w:r>
-      </w:hyperlink>
+      <w:r>
+        <w:rPr>
+          <w:i/>
+        </w:rPr>
+        <w:t>Etchless lithium niobate integrated photonics</w:t>
+      </w:r>
       <w:r>
         <w:t xml:space="preserve">.” </w:t>
       </w:r>
@@ -2435,6 +2743,18 @@
         </w:rPr>
         <w:t>INVITED</w:t>
       </w:r>
+      <w:r>
+        <w:t xml:space="preserve">  ·  </w:t>
+      </w:r>
+      <w:hyperlink r:id="rId45">
+        <w:r>
+          <w:rPr>
+            <w:color w:val="79933C"/>
+            <w:u w:val="single"/>
+          </w:rPr>
+          <w:t>Link</w:t>
+        </w:r>
+      </w:hyperlink>
     </w:p>
     <w:p>
       <w:pPr>
@@ -2457,16 +2777,12 @@
       <w:r>
         <w:t>, “</w:t>
       </w:r>
-      <w:hyperlink r:id="rId34">
-        <w:r>
-          <w:rPr>
-            <w:color w:val="18324A"/>
-            <w:u w:val="single"/>
-            <w:i w:val="true"/>
-          </w:rPr>
-          <w:t>Nonmetallic broadband visible-light absorbers with polarization and incident-angle insensitivity</w:t>
-        </w:r>
-      </w:hyperlink>
+      <w:r>
+        <w:rPr>
+          <w:i/>
+        </w:rPr>
+        <w:t>Nonmetallic broadband visible-light absorbers with polarization and incident-angle insensitivity</w:t>
+      </w:r>
       <w:r>
         <w:t xml:space="preserve">.” </w:t>
       </w:r>
@@ -2476,6 +2792,18 @@
         </w:rPr>
         <w:t>CLEO, San Jose, California, 2021</w:t>
       </w:r>
+      <w:r>
+        <w:t xml:space="preserve">  ·  </w:t>
+      </w:r>
+      <w:hyperlink r:id="rId34">
+        <w:r>
+          <w:rPr>
+            <w:color w:val="79933C"/>
+            <w:u w:val="single"/>
+          </w:rPr>
+          <w:t>Link</w:t>
+        </w:r>
+      </w:hyperlink>
     </w:p>
     <w:p>
       <w:pPr>
@@ -2498,16 +2826,12 @@
       <w:r>
         <w:t>, “</w:t>
       </w:r>
-      <w:hyperlink r:id="rId31">
-        <w:r>
-          <w:rPr>
-            <w:color w:val="18324A"/>
-            <w:u w:val="single"/>
-            <w:i w:val="true"/>
-          </w:rPr>
-          <w:t>Demonstration of on-chip gigahertz acousto-optic modulation at near-visible wavelengths</w:t>
-        </w:r>
-      </w:hyperlink>
+      <w:r>
+        <w:rPr>
+          <w:i/>
+        </w:rPr>
+        <w:t>Demonstration of on-chip gigahertz acousto-optic modulation at near-visible wavelengths</w:t>
+      </w:r>
       <w:r>
         <w:t xml:space="preserve">.” </w:t>
       </w:r>
@@ -2517,6 +2841,18 @@
         </w:rPr>
         <w:t>CLEO, San Jose, California, 2021</w:t>
       </w:r>
+      <w:r>
+        <w:t xml:space="preserve">  ·  </w:t>
+      </w:r>
+      <w:hyperlink r:id="rId31">
+        <w:r>
+          <w:rPr>
+            <w:color w:val="79933C"/>
+            <w:u w:val="single"/>
+          </w:rPr>
+          <w:t>Link</w:t>
+        </w:r>
+      </w:hyperlink>
     </w:p>
     <w:sectPr>
       <w:footerReference w:type="default" r:id="rId46"/>

</xml_diff>